<commit_message>
Modificando estructura de formatos
</commit_message>
<xml_diff>
--- a/public/report_templates/creditos/grupales/rptContrato.docx
+++ b/public/report_templates/creditos/grupales/rptContrato.docx
@@ -284,15 +284,15 @@
         <w:ind w:left="116" w:right="124"/>
       </w:pPr>
       <w:r>
+        <w:t xml:space="preserve">Los integrantes que conforman EL GRUPO se encuentran detallados en la Cartilla de Identificación que forma parte del presente Contrato. </w:t>
+      </w:r>
+    </w:p>
+    <w:p>
+      <w:pPr>
+        <w:ind w:left="-3" w:right="124"/>
+      </w:pPr>
+      <w:r>
         <w:lastRenderedPageBreak/>
-        <w:t xml:space="preserve">Los integrantes que conforman EL GRUPO se encuentran detallados en la Cartilla de Identificación que forma parte del presente Contrato. </w:t>
-      </w:r>
-    </w:p>
-    <w:p>
-      <w:pPr>
-        <w:ind w:left="-3" w:right="124"/>
-      </w:pPr>
-      <w:r>
         <w:t xml:space="preserve">Se entiende y precisa que, para todos los efectos del presente Contrato, tales como la cancelación de EL CRÉDITO, ejecución de pagos anticipados, aplicación de la regulación especial y/o cualquier otra consideración legal o contractual el cliente es EL </w:t>
       </w:r>
     </w:p>
@@ -554,18 +554,15 @@
         <w:t xml:space="preserve"> </w:t>
       </w:r>
       <w:r>
-        <w:t xml:space="preserve">todas las obligaciones asumidas por EL GRUPO; incluyendo los intereses compensatorios y moratorios, comisiones, gastos u otros conceptos de toda clase que se deriven de este Contrato, siempre que se encuentren permitidos por el Reglamento de Gestión de Conducta de Mercado del Sistema Financiero, aprobado mediante la Resolución N° 3274-2017 (“Reglamento”) y/o el Reglamento de </w:t>
-      </w:r>
+        <w:t xml:space="preserve">todas las obligaciones asumidas por EL GRUPO; incluyendo los intereses compensatorios y moratorios, comisiones, gastos u otros conceptos de toda clase que se deriven de este Contrato, siempre que se encuentren permitidos por el Reglamento de Gestión de Conducta de Mercado del Sistema Financiero, aprobado mediante la Resolución N° 3274-2017 (“Reglamento”) y/o el Reglamento de Comisiones y Gastos del Sistema Financiero, aprobado mediante la Resolución SBS N° 3748-2023, y cumplan con el criterio señalado en la cláusula quinta siguiente. </w:t>
+      </w:r>
+    </w:p>
+    <w:p>
+      <w:pPr>
+        <w:ind w:left="116" w:right="124"/>
+      </w:pPr>
       <w:r>
         <w:lastRenderedPageBreak/>
-        <w:t xml:space="preserve">Comisiones y Gastos del Sistema Financiero, aprobado mediante la Resolución SBS N° 3748-2023, y cumplan con el criterio señalado en la cláusula quinta siguiente. </w:t>
-      </w:r>
-    </w:p>
-    <w:p>
-      <w:pPr>
-        <w:ind w:left="116" w:right="124"/>
-      </w:pPr>
-      <w:r>
         <w:t>${</w:t>
       </w:r>
       <w:proofErr w:type="spellStart"/>
@@ -914,35 +911,32 @@
         <w:t xml:space="preserve">, </w:t>
       </w:r>
       <w:r>
-        <w:t xml:space="preserve">se podrá habilitar una funcionalidad para que EL COMITÉ pueda asignar los pagos parciales realizados a cada miembro de EL GRUPO, de forma que se facilite la gestión de la recaudación de la cuota grupal. La información sobre la habilitación </w:t>
-      </w:r>
+        <w:t xml:space="preserve">se podrá habilitar una funcionalidad para que EL COMITÉ pueda asignar los pagos parciales realizados a cada miembro de EL GRUPO, de forma que se facilite la gestión de la recaudación de la cuota grupal. La información sobre la habilitación y detalles de la funcionalidad mencionada será difundida a través de la página web </w:t>
+      </w:r>
+      <w:r>
+        <w:t>${</w:t>
+      </w:r>
+      <w:proofErr w:type="spellStart"/>
+      <w:r>
+        <w:t>empresa_pagina</w:t>
+      </w:r>
+      <w:proofErr w:type="spellEnd"/>
+      <w:r>
+        <w:t>}</w:t>
+      </w:r>
+    </w:p>
+    <w:p>
+      <w:pPr>
+        <w:spacing w:after="0" w:line="259" w:lineRule="auto"/>
+        <w:ind w:left="0" w:right="0" w:firstLine="0"/>
+      </w:pPr>
+    </w:p>
+    <w:p>
+      <w:pPr>
+        <w:ind w:left="-3" w:right="11"/>
+      </w:pPr>
       <w:r>
         <w:lastRenderedPageBreak/>
-        <w:t xml:space="preserve">y detalles de la funcionalidad mencionada será difundida a través de la página web </w:t>
-      </w:r>
-      <w:r>
-        <w:t>${</w:t>
-      </w:r>
-      <w:proofErr w:type="spellStart"/>
-      <w:r>
-        <w:t>empresa_pagina</w:t>
-      </w:r>
-      <w:proofErr w:type="spellEnd"/>
-      <w:r>
-        <w:t>}</w:t>
-      </w:r>
-    </w:p>
-    <w:p>
-      <w:pPr>
-        <w:spacing w:after="0" w:line="259" w:lineRule="auto"/>
-        <w:ind w:left="0" w:right="0" w:firstLine="0"/>
-      </w:pPr>
-    </w:p>
-    <w:p>
-      <w:pPr>
-        <w:ind w:left="-3" w:right="11"/>
-      </w:pPr>
-      <w:r>
         <w:t>${</w:t>
       </w:r>
       <w:proofErr w:type="spellStart"/>
@@ -1143,11 +1137,7 @@
         <w:t xml:space="preserve"> </w:t>
       </w:r>
       <w:r>
-        <w:t xml:space="preserve">podrá efectuar el cobro de </w:t>
-      </w:r>
-      <w:r>
-        <w:lastRenderedPageBreak/>
-        <w:t xml:space="preserve">interés moratorio o del concepto aplicable en caso de incumplimiento según lo permita la normativa vigente. </w:t>
+        <w:t xml:space="preserve">podrá efectuar el cobro de interés moratorio o del concepto aplicable en caso de incumplimiento según lo permita la normativa vigente. </w:t>
       </w:r>
     </w:p>
     <w:p>
@@ -1173,6 +1163,7 @@
         <w:jc w:val="both"/>
       </w:pPr>
       <w:r>
+        <w:lastRenderedPageBreak/>
         <w:t>SEXTA</w:t>
       </w:r>
       <w:r>
@@ -1447,67 +1438,67 @@
         <w:t>}</w:t>
       </w:r>
       <w:r>
-        <w:t xml:space="preserve">, otros Clientes </w:t>
+        <w:t xml:space="preserve">, otros Clientes de </w:t>
+      </w:r>
+      <w:r>
+        <w:t>${</w:t>
+      </w:r>
+      <w:proofErr w:type="spellStart"/>
+      <w:r>
+        <w:t>empresa_nombre</w:t>
+      </w:r>
+      <w:proofErr w:type="spellEnd"/>
+      <w:r>
+        <w:t>}</w:t>
+      </w:r>
+      <w:r>
+        <w:t xml:space="preserve"> </w:t>
+      </w:r>
+      <w:r>
+        <w:t xml:space="preserve">y/o público en general; j) Mantiene saldos menores en beneficio de </w:t>
+      </w:r>
+      <w:r>
+        <w:t>${</w:t>
+      </w:r>
+      <w:proofErr w:type="spellStart"/>
+      <w:r>
+        <w:t>empresa_nombre</w:t>
+      </w:r>
+      <w:proofErr w:type="spellEnd"/>
+      <w:r>
+        <w:t>}</w:t>
+      </w:r>
+      <w:r>
+        <w:t xml:space="preserve"> </w:t>
+      </w:r>
+      <w:r>
+        <w:t xml:space="preserve">y este, con base en sus políticas internas, decide condonar dichos montos. </w:t>
+      </w:r>
+    </w:p>
+    <w:p>
+      <w:pPr>
+        <w:ind w:left="116" w:right="124"/>
+      </w:pPr>
+      <w:r>
+        <w:t xml:space="preserve">Para los supuestos enunciados, </w:t>
+      </w:r>
+      <w:r>
+        <w:t>${</w:t>
+      </w:r>
+      <w:proofErr w:type="spellStart"/>
+      <w:r>
+        <w:t>empresa_nombre</w:t>
+      </w:r>
+      <w:proofErr w:type="spellEnd"/>
+      <w:r>
+        <w:t>}</w:t>
+      </w:r>
+      <w:r>
+        <w:t xml:space="preserve">, dependiendo de la causal, podrá bloquear temporalmente la cuenta donde se soporta EL CRÉDITO, comunicando dicha </w:t>
       </w:r>
       <w:r>
         <w:lastRenderedPageBreak/>
-        <w:t xml:space="preserve">de </w:t>
-      </w:r>
-      <w:r>
-        <w:t>${</w:t>
-      </w:r>
-      <w:proofErr w:type="spellStart"/>
-      <w:r>
-        <w:t>empresa_nombre</w:t>
-      </w:r>
-      <w:proofErr w:type="spellEnd"/>
-      <w:r>
-        <w:t>}</w:t>
-      </w:r>
-      <w:r>
-        <w:t xml:space="preserve"> </w:t>
-      </w:r>
-      <w:r>
-        <w:t xml:space="preserve">y/o público en general; j) Mantiene saldos menores en beneficio de </w:t>
-      </w:r>
-      <w:r>
-        <w:t>${</w:t>
-      </w:r>
-      <w:proofErr w:type="spellStart"/>
-      <w:r>
-        <w:t>empresa_nombre</w:t>
-      </w:r>
-      <w:proofErr w:type="spellEnd"/>
-      <w:r>
-        <w:t>}</w:t>
-      </w:r>
-      <w:r>
-        <w:t xml:space="preserve"> </w:t>
-      </w:r>
-      <w:r>
-        <w:t xml:space="preserve">y este, con base en sus políticas internas, decide condonar dichos montos. </w:t>
-      </w:r>
-    </w:p>
-    <w:p>
-      <w:pPr>
-        <w:ind w:left="116" w:right="124"/>
-      </w:pPr>
-      <w:r>
-        <w:t xml:space="preserve">Para los supuestos enunciados, </w:t>
-      </w:r>
-      <w:r>
-        <w:t>${</w:t>
-      </w:r>
-      <w:proofErr w:type="spellStart"/>
-      <w:r>
-        <w:t>empresa_nombre</w:t>
-      </w:r>
-      <w:proofErr w:type="spellEnd"/>
-      <w:r>
-        <w:t>}</w:t>
-      </w:r>
-      <w:r>
-        <w:t xml:space="preserve">, dependiendo de la causal, podrá bloquear temporalmente la cuenta donde se soporta EL CRÉDITO, comunicando dicha acción a través de los medios de comunicación establecidos en el presente Contrato, sin necesidad de aviso ni conformidad previa, hasta que EL GRUPO regularice la situación que originó el bloqueo y, en caso ello no ocurra, podrá proceder a comunicar la resolución del Contrato a través de los medios de información directos establecidos en el presente documento. </w:t>
+        <w:t xml:space="preserve">acción a través de los medios de comunicación establecidos en el presente Contrato, sin necesidad de aviso ni conformidad previa, hasta que EL GRUPO regularice la situación que originó el bloqueo y, en caso ello no ocurra, podrá proceder a comunicar la resolución del Contrato a través de los medios de información directos establecidos en el presente documento. </w:t>
       </w:r>
       <w:r>
         <w:t>${</w:t>
@@ -1754,7 +1745,6 @@
         <w:ind w:left="-3" w:right="4"/>
       </w:pPr>
       <w:r>
-        <w:lastRenderedPageBreak/>
         <w:t xml:space="preserve">EL GRUPO deberá comunicar a </w:t>
       </w:r>
       <w:r>
@@ -1819,7 +1809,11 @@
         <w:ind w:left="-3" w:right="2"/>
       </w:pPr>
       <w:r>
-        <w:t xml:space="preserve">En caso algún integrante de EL GRUPO sea iletrado y/o tenga incapacidad para firmar y el monto otorgado de manera individual al interior de EL GRUPO sea menor a S/ 3,000.00 (Tres Mil con 00/100 Soles), solo deberá imprimir su huella digital en el presente Contrato y demás documentos. En caso el monto sea mayor o igual a S/ 3,000.00 (Tres Mil con 00/100 Soles), deberá imprimir su huella digital en el presente Contrato y demás documentos, junto con la firma de un testigo a ruego. En ningún caso los colaboradores de </w:t>
+        <w:t xml:space="preserve">En caso algún integrante de EL GRUPO sea iletrado y/o tenga incapacidad para firmar y el monto otorgado de manera individual al interior de EL GRUPO sea menor a S/ 3,000.00 (Tres Mil con 00/100 Soles), solo deberá imprimir su huella digital en el presente Contrato </w:t>
+      </w:r>
+      <w:r>
+        <w:lastRenderedPageBreak/>
+        <w:t xml:space="preserve">y demás documentos. En caso el monto sea mayor o igual a S/ 3,000.00 (Tres Mil con 00/100 Soles), deberá imprimir su huella digital en el presente Contrato y demás documentos, junto con la firma de un testigo a ruego. En ningún caso los colaboradores de </w:t>
       </w:r>
       <w:r>
         <w:t>${</w:t>
@@ -2017,45 +2011,45 @@
         <w:t xml:space="preserve"> </w:t>
       </w:r>
       <w:r>
-        <w:t xml:space="preserve">comunicará a EL GRUPO, a través de medios de comunicación directos establecidos en la cláusula Décimo Quinta del presente Contrato, las modificaciones efectuadas, con una anticipación no menor a cuarenta y cinco (45) días calendario previos a la fecha de </w:t>
+        <w:t xml:space="preserve">comunicará a EL GRUPO, a través de medios de comunicación directos establecidos en la cláusula Décimo Quinta del presente Contrato, las modificaciones efectuadas, con una anticipación no menor a cuarenta y cinco (45) días calendario previos a la fecha de entrada en vigencia de las mismas y/o a la fecha en la que regirán las nuevas condiciones del Contrato. En cualquier caso, la comunicación indicará el momento a partir del cual las modificaciones entrarán en vigencia. Dentro de dicho plazo, y en caso EL GRUPO no esté de acuerdo con las modificaciones, podrá optar por resolver el Contrato a través de los canales que </w:t>
+      </w:r>
+      <w:r>
+        <w:t>${</w:t>
+      </w:r>
+      <w:proofErr w:type="spellStart"/>
+      <w:r>
+        <w:t>empresa_nombre</w:t>
+      </w:r>
+      <w:proofErr w:type="spellEnd"/>
+      <w:r>
+        <w:t>}</w:t>
+      </w:r>
+      <w:r>
+        <w:t xml:space="preserve"> </w:t>
+      </w:r>
+      <w:r>
+        <w:t xml:space="preserve">ponga a su disposición (los cuales serán como mínimo los mismos canales provistos para la contratación de EL CRÉDITO), en cuyo caso tendrá un plazo de cuarenta y cinco (45) días calendario, contados a partir de la fecha en que comunicó a </w:t>
+      </w:r>
+      <w:r>
+        <w:t>${</w:t>
+      </w:r>
+      <w:proofErr w:type="spellStart"/>
+      <w:r>
+        <w:t>empresa_nombre</w:t>
+      </w:r>
+      <w:proofErr w:type="spellEnd"/>
+      <w:r>
+        <w:t>}</w:t>
+      </w:r>
+      <w:r>
+        <w:t xml:space="preserve"> </w:t>
+      </w:r>
+      <w:r>
+        <w:t xml:space="preserve">tal intención, para pagar la totalidad del Saldo Deudor, en forma previa a la resolución del Contrato. De no ejercer este derecho </w:t>
       </w:r>
       <w:r>
         <w:lastRenderedPageBreak/>
-        <w:t xml:space="preserve">entrada en vigencia de las mismas y/o a la fecha en la que regirán las nuevas condiciones del Contrato. En cualquier caso, la comunicación indicará el momento a partir del cual las modificaciones entrarán en vigencia. Dentro de dicho plazo, y en caso EL GRUPO no esté de acuerdo con las modificaciones, podrá optar por resolver el Contrato a través de los canales que </w:t>
-      </w:r>
-      <w:r>
-        <w:t>${</w:t>
-      </w:r>
-      <w:proofErr w:type="spellStart"/>
-      <w:r>
-        <w:t>empresa_nombre</w:t>
-      </w:r>
-      <w:proofErr w:type="spellEnd"/>
-      <w:r>
-        <w:t>}</w:t>
-      </w:r>
-      <w:r>
-        <w:t xml:space="preserve"> </w:t>
-      </w:r>
-      <w:r>
-        <w:t xml:space="preserve">ponga a su disposición (los cuales serán como mínimo los mismos canales provistos para la contratación de EL CRÉDITO), en cuyo caso tendrá un plazo de cuarenta y cinco (45) días calendario, contados a partir de la fecha en que comunicó a </w:t>
-      </w:r>
-      <w:r>
-        <w:t>${</w:t>
-      </w:r>
-      <w:proofErr w:type="spellStart"/>
-      <w:r>
-        <w:t>empresa_nombre</w:t>
-      </w:r>
-      <w:proofErr w:type="spellEnd"/>
-      <w:r>
-        <w:t>}</w:t>
-      </w:r>
-      <w:r>
-        <w:t xml:space="preserve"> </w:t>
-      </w:r>
-      <w:r>
-        <w:t xml:space="preserve">tal intención, para pagar la totalidad del Saldo Deudor, en forma previa a la resolución del Contrato. De no ejercer este derecho dentro del plazo establecido anteriormente, se entenderá que EL GRUPO acepta las modificaciones en su totalidad. Para estos efectos, EL GRUPO acepta expresamente que su silencio constituye manifestación de voluntad y aceptación a las modificaciones efectuadas por </w:t>
+        <w:t xml:space="preserve">dentro del plazo establecido anteriormente, se entenderá que EL GRUPO acepta las modificaciones en su totalidad. Para estos efectos, EL GRUPO acepta expresamente que su silencio constituye manifestación de voluntad y aceptación a las modificaciones efectuadas por </w:t>
       </w:r>
       <w:r>
         <w:t>${</w:t>
@@ -2255,11 +2249,7 @@
         <w:t xml:space="preserve"> </w:t>
       </w:r>
       <w:r>
-        <w:t xml:space="preserve">comunicará su decisión dentro de los siete (7) </w:t>
-      </w:r>
-      <w:r>
-        <w:lastRenderedPageBreak/>
-        <w:t xml:space="preserve">días posteriores a la fecha en que hace efectiva la misma. Asimismo, en aplicación de las Disposiciones Prudenciales, </w:t>
+        <w:t xml:space="preserve">comunicará su decisión dentro de los siete (7) días posteriores a la fecha en que hace efectiva la misma. Asimismo, en aplicación de las Disposiciones Prudenciales, </w:t>
       </w:r>
       <w:r>
         <w:t>${</w:t>
@@ -2312,6 +2302,7 @@
         <w:jc w:val="both"/>
       </w:pPr>
       <w:r>
+        <w:lastRenderedPageBreak/>
         <w:t xml:space="preserve">DÉCIMO </w:t>
       </w:r>
       <w:r>
@@ -2526,11 +2517,7 @@
         <w:ind w:left="-3" w:right="124"/>
       </w:pPr>
       <w:r>
-        <w:t xml:space="preserve">EL COMITÉ podrá solicitar la incorporación de nuevos integrantes en EL GRUPO, ante lo que se procederá con la cancelación de EL CRÉDITO y el otorgamiento de uno nuevo que considere la ampliación del monto de EL CRÉDITO, así como de ser necesaria, de la vigencia del mismo. Para tales efectos cada uno de los miembros de EL GRUPO (o su apoderado) deberá suscribir la “Solicitud de Crédito”, la cual estará sujeta a la aprobación </w:t>
-      </w:r>
-      <w:r>
-        <w:lastRenderedPageBreak/>
-        <w:t xml:space="preserve">de </w:t>
+        <w:t xml:space="preserve">EL COMITÉ podrá solicitar la incorporación de nuevos integrantes en EL GRUPO, ante lo que se procederá con la cancelación de EL CRÉDITO y el otorgamiento de uno nuevo que considere la ampliación del monto de EL CRÉDITO, así como de ser necesaria, de la vigencia del mismo. Para tales efectos cada uno de los miembros de EL GRUPO (o su apoderado) deberá suscribir la “Solicitud de Crédito”, la cual estará sujeta a la aprobación de </w:t>
       </w:r>
       <w:r>
         <w:t>${</w:t>
@@ -2564,6 +2551,7 @@
         <w:jc w:val="both"/>
       </w:pPr>
       <w:r>
+        <w:lastRenderedPageBreak/>
         <w:t>DÉCIMO OCTAVA</w:t>
       </w:r>
       <w:r>
@@ -2765,7 +2753,6 @@
         <w:ind w:left="-3" w:right="124"/>
       </w:pPr>
       <w:r>
-        <w:lastRenderedPageBreak/>
         <w:t>${</w:t>
       </w:r>
       <w:proofErr w:type="spellStart"/>
@@ -2847,6 +2834,7 @@
         <w:ind w:left="-3" w:right="124"/>
       </w:pPr>
       <w:r>
+        <w:lastRenderedPageBreak/>
         <w:t>${</w:t>
       </w:r>
       <w:proofErr w:type="spellStart"/>
@@ -3139,64 +3127,64 @@
         <w:t xml:space="preserve"> </w:t>
       </w:r>
       <w:r>
-        <w:t xml:space="preserve">podrá tomar las </w:t>
+        <w:t xml:space="preserve">podrá tomar las siguientes acciones: 1. Terminar de manera anticipada el Contrato, en cuyo caso, la consecuencia inmediata será que EL GRUPO se encuentre obligado a pagar el total del Saldo Deudor que tenga con </w:t>
+      </w:r>
+      <w:r>
+        <w:t>${</w:t>
+      </w:r>
+      <w:proofErr w:type="spellStart"/>
+      <w:r>
+        <w:t>empresa_nombre</w:t>
+      </w:r>
+      <w:proofErr w:type="spellEnd"/>
+      <w:r>
+        <w:t>}</w:t>
+      </w:r>
+      <w:r>
+        <w:t xml:space="preserve">. 2. Bloquear temporal o definitivamente la cuenta. 3. Cargar el saldo deudor en las cuentas corrientes que puedan existir a nombre de EL </w:t>
+      </w:r>
+    </w:p>
+    <w:p>
+      <w:pPr>
+        <w:ind w:left="-3" w:right="124"/>
+      </w:pPr>
+      <w:r>
+        <w:t xml:space="preserve">GRUPO, según las liquidaciones que practique, de conformidad con la ley aplicable y con las disposiciones que al efecto se hayan pactado en el respectivo contrato. En cualquiera de los casos antes señalados, </w:t>
+      </w:r>
+      <w:r>
+        <w:t>${</w:t>
+      </w:r>
+      <w:proofErr w:type="spellStart"/>
+      <w:r>
+        <w:t>empresa_nombre</w:t>
+      </w:r>
+      <w:proofErr w:type="spellEnd"/>
+      <w:r>
+        <w:t>}</w:t>
+      </w:r>
+      <w:r>
+        <w:t xml:space="preserve"> </w:t>
+      </w:r>
+      <w:r>
+        <w:t xml:space="preserve">comunicará en un plazo posterior no mayor a quince (15) días la aplicación del supuesto correspondiente mediante los mecanismos de comunicación directos establecidos en la cláusula Décimo Quinta. En el supuesto que, se hubiesen procesado Transacciones (abonos y/o cargos, aperturas, duplicidad de códigos, entre otros) con error operativo, EL GRUPO autoriza a </w:t>
+      </w:r>
+      <w:r>
+        <w:t>${</w:t>
+      </w:r>
+      <w:proofErr w:type="spellStart"/>
+      <w:r>
+        <w:t>empresa_nombre</w:t>
+      </w:r>
+      <w:proofErr w:type="spellEnd"/>
+      <w:r>
+        <w:t>}</w:t>
+      </w:r>
+      <w:r>
+        <w:t xml:space="preserve">, sin previo aviso, a realizar cargos y/o extornos o regularizaciones </w:t>
       </w:r>
       <w:r>
         <w:lastRenderedPageBreak/>
-        <w:t xml:space="preserve">siguientes acciones: 1. Terminar de manera anticipada el Contrato, en cuyo caso, la consecuencia inmediata será que EL GRUPO se encuentre obligado a pagar el total del Saldo Deudor que tenga con </w:t>
-      </w:r>
-      <w:r>
-        <w:t>${</w:t>
-      </w:r>
-      <w:proofErr w:type="spellStart"/>
-      <w:r>
-        <w:t>empresa_nombre</w:t>
-      </w:r>
-      <w:proofErr w:type="spellEnd"/>
-      <w:r>
-        <w:t>}</w:t>
-      </w:r>
-      <w:r>
-        <w:t xml:space="preserve">. 2. Bloquear temporal o definitivamente la cuenta. 3. Cargar el saldo deudor en las cuentas corrientes que puedan existir a nombre de EL </w:t>
-      </w:r>
-    </w:p>
-    <w:p>
-      <w:pPr>
-        <w:ind w:left="-3" w:right="124"/>
-      </w:pPr>
-      <w:r>
-        <w:t xml:space="preserve">GRUPO, según las liquidaciones que practique, de conformidad con la ley aplicable y con las disposiciones que al efecto se hayan pactado en el respectivo contrato. En cualquiera de los casos antes señalados, </w:t>
-      </w:r>
-      <w:r>
-        <w:t>${</w:t>
-      </w:r>
-      <w:proofErr w:type="spellStart"/>
-      <w:r>
-        <w:t>empresa_nombre</w:t>
-      </w:r>
-      <w:proofErr w:type="spellEnd"/>
-      <w:r>
-        <w:t>}</w:t>
-      </w:r>
-      <w:r>
-        <w:t xml:space="preserve"> </w:t>
-      </w:r>
-      <w:r>
-        <w:t xml:space="preserve">comunicará en un plazo posterior no mayor a quince (15) días la aplicación del supuesto correspondiente mediante los mecanismos de comunicación directos establecidos en la cláusula Décimo Quinta. En el supuesto que, se hubiesen procesado Transacciones (abonos y/o cargos, aperturas, duplicidad de códigos, entre otros) con error operativo, EL GRUPO autoriza a </w:t>
-      </w:r>
-      <w:r>
-        <w:t>${</w:t>
-      </w:r>
-      <w:proofErr w:type="spellStart"/>
-      <w:r>
-        <w:t>empresa_nombre</w:t>
-      </w:r>
-      <w:proofErr w:type="spellEnd"/>
-      <w:r>
-        <w:t>}</w:t>
-      </w:r>
-      <w:r>
-        <w:t xml:space="preserve">, sin previo aviso, a realizar cargos y/o extornos o regularizaciones que se hubiesen podido realizar en la cuenta o crédito, los mismos que, de ser el caso, serán informados con posterioridad a EL GRUPO, de conformidad con los mecanismos de información directos en la cláusula Décimo Quinta. </w:t>
+        <w:t xml:space="preserve">que se hubiesen podido realizar en la cuenta o crédito, los mismos que, de ser el caso, serán informados con posterioridad a EL GRUPO, de conformidad con los mecanismos de información directos en la cláusula Décimo Quinta. </w:t>
       </w:r>
     </w:p>
     <w:p>
@@ -3385,11 +3373,7 @@
         <w:t>}</w:t>
       </w:r>
       <w:r>
-        <w:t xml:space="preserve">, sea esta física, electrónica u por </w:t>
-      </w:r>
-      <w:r>
-        <w:lastRenderedPageBreak/>
-        <w:t xml:space="preserve">otro medio. Asimismo, EL GRUPO acuerda que la copia del presente Contrato y la Hoja Resumen le será entregada a EL COMITÉ. </w:t>
+        <w:t xml:space="preserve">, sea esta física, electrónica u por otro medio. Asimismo, EL GRUPO acuerda que la copia del presente Contrato y la Hoja Resumen le será entregada a EL COMITÉ. </w:t>
       </w:r>
     </w:p>
     <w:p>
@@ -3715,41 +3699,6 @@
       </w:r>
     </w:p>
     <w:p/>
-    <w:p/>
-    <w:p/>
-    <w:p/>
-    <w:p/>
-    <w:p/>
-    <w:p/>
-    <w:p>
-      <w:pPr>
-        <w:ind w:left="0" w:firstLine="0"/>
-        <w:sectPr>
-          <w:headerReference w:type="even" r:id="rId8"/>
-          <w:headerReference w:type="default" r:id="rId9"/>
-          <w:footerReference w:type="even" r:id="rId10"/>
-          <w:footerReference w:type="default" r:id="rId11"/>
-          <w:headerReference w:type="first" r:id="rId12"/>
-          <w:footerReference w:type="first" r:id="rId13"/>
-          <w:pgSz w:w="11911" w:h="16841"/>
-          <w:pgMar w:top="1329" w:right="1561" w:bottom="1343" w:left="1700" w:header="327" w:footer="706" w:gutter="0"/>
-          <w:cols w:space="720"/>
-        </w:sectPr>
-      </w:pPr>
-    </w:p>
-    <w:p>
-      <w:pPr>
-        <w:tabs>
-          <w:tab w:val="left" w:pos="1575"/>
-        </w:tabs>
-        <w:ind w:left="0" w:firstLine="0"/>
-        <w:rPr>
-          <w:rFonts w:ascii="DejaVu Sans Light" w:hAnsi="DejaVu Sans Light" w:cs="DejaVu Sans Light"/>
-          <w:sz w:val="19"/>
-          <w:szCs w:val="19"/>
-        </w:rPr>
-      </w:pPr>
-    </w:p>
     <w:p>
       <w:pPr>
         <w:tabs>
@@ -3761,16 +3710,32 @@
           <w:sz w:val="19"/>
           <w:szCs w:val="19"/>
         </w:rPr>
-      </w:pPr>
-      <w:r>
+        <w:sectPr>
+          <w:headerReference w:type="even" r:id="rId8"/>
+          <w:headerReference w:type="default" r:id="rId9"/>
+          <w:footerReference w:type="even" r:id="rId10"/>
+          <w:footerReference w:type="default" r:id="rId11"/>
+          <w:headerReference w:type="first" r:id="rId12"/>
+          <w:footerReference w:type="first" r:id="rId13"/>
+          <w:type w:val="continuous"/>
+          <w:pgSz w:w="11911" w:h="16841"/>
+          <w:pgMar w:top="1329" w:right="1561" w:bottom="1343" w:left="1700" w:header="327" w:footer="706" w:gutter="0"/>
+          <w:cols w:space="720"/>
+        </w:sectPr>
+      </w:pPr>
+    </w:p>
+    <w:p>
+      <w:pPr>
+        <w:tabs>
+          <w:tab w:val="left" w:pos="930"/>
+        </w:tabs>
+        <w:spacing w:after="0" w:line="240" w:lineRule="auto"/>
         <w:rPr>
           <w:rFonts w:ascii="DejaVu Sans Light" w:hAnsi="DejaVu Sans Light" w:cs="DejaVu Sans Light"/>
           <w:sz w:val="19"/>
           <w:szCs w:val="19"/>
         </w:rPr>
-        <w:lastRenderedPageBreak/>
-        <w:tab/>
-      </w:r>
+      </w:pPr>
     </w:p>
     <w:p>
       <w:pPr>
@@ -3824,7 +3789,6 @@
           <w:szCs w:val="19"/>
         </w:rPr>
         <w:sectPr>
-          <w:type w:val="continuous"/>
           <w:pgSz w:w="11911" w:h="16841"/>
           <w:pgMar w:top="1329" w:right="1561" w:bottom="1343" w:left="1700" w:header="327" w:footer="706" w:gutter="0"/>
           <w:cols w:space="720"/>
@@ -4524,16 +4488,16 @@
         <w:sz w:val="20"/>
       </w:rPr>
       <w:drawing>
-        <wp:anchor distT="0" distB="0" distL="114300" distR="114300" simplePos="0" relativeHeight="251664384" behindDoc="0" locked="0" layoutInCell="1" allowOverlap="1" wp14:anchorId="58844212" wp14:editId="64E789F9">
+        <wp:anchor distT="0" distB="0" distL="114300" distR="114300" simplePos="0" relativeHeight="251664384" behindDoc="0" locked="0" layoutInCell="1" allowOverlap="1" wp14:anchorId="58844212" wp14:editId="13E1F9C4">
           <wp:simplePos x="0" y="0"/>
-          <wp:positionH relativeFrom="column">
-            <wp:posOffset>4140201</wp:posOffset>
+          <wp:positionH relativeFrom="margin">
+            <wp:align>right</wp:align>
           </wp:positionH>
           <wp:positionV relativeFrom="paragraph">
             <wp:posOffset>40005</wp:posOffset>
           </wp:positionV>
-          <wp:extent cx="1662518" cy="552450"/>
-          <wp:effectExtent l="0" t="0" r="0" b="0"/>
+          <wp:extent cx="1352550" cy="449449"/>
+          <wp:effectExtent l="0" t="0" r="0" b="8255"/>
           <wp:wrapNone/>
           <wp:docPr id="6" name="Imagen 6" descr="C:\Users\PC-TAM02\Downloads\FLOR YA NO ME FASTIDIES.png"/>
           <wp:cNvGraphicFramePr>
@@ -4564,7 +4528,7 @@
                 <pic:spPr bwMode="auto">
                   <a:xfrm>
                     <a:off x="0" y="0"/>
-                    <a:ext cx="1672036" cy="555613"/>
+                    <a:ext cx="1352550" cy="449449"/>
                   </a:xfrm>
                   <a:prstGeom prst="rect">
                     <a:avLst/>
@@ -4655,7 +4619,6 @@
       <w:tab/>
     </w:r>
   </w:p>
-  <w:p/>
   <w:p/>
 </w:hdr>
 </file>

</xml_diff>